<commit_message>
Clarify restart recovery validation
</commit_message>
<xml_diff>
--- a/docs/RMF_VDA5050_Passing_Bay_PoC_Simulation_and_Field_Guide_2026-09-20.docx
+++ b/docs/RMF_VDA5050_Passing_Bay_PoC_Simulation_and_Field_Guide_2026-09-20.docx
@@ -4352,7 +4352,7 @@
         <w:pStyle w:val="BodyText"/>
       </w:pPr>
       <w:r>
-        <w:t>SafeStop MANUAL: clean-start 완료 후 A1만 robot_not_eligible로 거절됐고 A2 작업은 ADMIT됐다. Block fault는 없었다. Corridor 내부에서 Arbiter를 재시작한 경우에는 로봇이 종점에 도착해도 recovery.required가 자동 해제되지 않았다.</w:t>
+        <w:t>SafeStop MANUAL: clean-start 완료 후 A1만 robot_not_eligible로 거절됐고 A2 작업은 ADMIT됐다. Block fault는 없었다. Corridor 내부에서 Arbiter를 재시작한 실제 실행에서는 로봇이 종점에 도착해도 recovery.required가 자동 해제되지 않는 것을 확인했다. 당시 verifier는 추적기 상태 문제로 timeout 되었고, 이후 SafeStop 위치 갱신 로직을 수정해 단위 테스트로 검증했다. 수정 후 이 재시작 시나리오의 전체 런타임 재실행은 아직 남아 있다.</w:t>
       </w:r>
     </w:p>
     <w:p>
@@ -4368,7 +4368,7 @@
         <w:pStyle w:val="BodyText"/>
       </w:pPr>
       <w:r>
-        <w:t>검증 결과: 전체 unittest 186개 통과. 정상 2v2와 E-stop, State loss, SafeStop MANUAL, restart recovery를 실제 MQTT → Fleet Adapter → RMF → Task Gate → Simulator 흐름에서 확인했다.</w:t>
+        <w:t>검증 결과: 전체 unittest 186개 통과. 정상 2v2와 E-stop, State loss, SafeStop MANUAL은 실제 MQTT → Fleet Adapter → RMF → Task Gate → Simulator 흐름에서 완료 검증했다. 재시작 recovery는 recovery.required 유지까지 실제 실행으로 확인했고, 후속 추적기 수정은 단위 테스트로 검증했다.</w:t>
       </w:r>
     </w:p>
     <w:p>

</xml_diff>